<commit_message>
exercise ppf and L3
</commit_message>
<xml_diff>
--- a/exercises/Exercise on Production Possibilities_Questions.docx
+++ b/exercises/Exercise on Production Possibilities_Questions.docx
@@ -1,6 +1,6 @@
 
 <file path=word/document.xml><?xml version="1.0" encoding="utf-8"?>
-<w:document xmlns:wpc="http://schemas.microsoft.com/office/word/2010/wordprocessingCanvas" xmlns:cx="http://schemas.microsoft.com/office/drawing/2014/chartex" xmlns:cx1="http://schemas.microsoft.com/office/drawing/2015/9/8/chartex" xmlns:cx2="http://schemas.microsoft.com/office/drawing/2015/10/21/chartex" xmlns:cx3="http://schemas.microsoft.com/office/drawing/2016/5/9/chartex" xmlns:cx4="http://schemas.microsoft.com/office/drawing/2016/5/10/chartex" xmlns:cx5="http://schemas.microsoft.com/office/drawing/2016/5/11/chartex" xmlns:cx6="http://schemas.microsoft.com/office/drawing/2016/5/12/chartex" xmlns:cx7="http://schemas.microsoft.com/office/drawing/2016/5/13/chartex" xmlns:cx8="http://schemas.microsoft.com/office/drawing/2016/5/14/chartex" xmlns:mc="http://schemas.openxmlformats.org/markup-compatibility/2006" xmlns:aink="http://schemas.microsoft.com/office/drawing/2016/ink" xmlns:am3d="http://schemas.microsoft.com/office/drawing/2017/model3d" xmlns:o="urn:schemas-microsoft-com:office:office" xmlns:r="http://schemas.openxmlformats.org/officeDocument/2006/relationships" xmlns:m="http://schemas.openxmlformats.org/officeDocument/2006/math" xmlns:v="urn:schemas-microsoft-com:vml" xmlns:wp14="http://schemas.microsoft.com/office/word/2010/wordprocessingDrawing" xmlns:wp="http://schemas.openxmlformats.org/drawingml/2006/wordprocessingDrawing" xmlns:w10="urn:schemas-microsoft-com:office:word" xmlns:w="http://schemas.openxmlformats.org/wordprocessingml/2006/main" xmlns:w14="http://schemas.microsoft.com/office/word/2010/wordml" xmlns:w15="http://schemas.microsoft.com/office/word/2012/wordml" xmlns:w16cex="http://schemas.microsoft.com/office/word/2018/wordml/cex" xmlns:w16cid="http://schemas.microsoft.com/office/word/2016/wordml/cid" xmlns:w16="http://schemas.microsoft.com/office/word/2018/wordml" xmlns:w16se="http://schemas.microsoft.com/office/word/2015/wordml/symex" xmlns:wpg="http://schemas.microsoft.com/office/word/2010/wordprocessingGroup" xmlns:wpi="http://schemas.microsoft.com/office/word/2010/wordprocessingInk" xmlns:wne="http://schemas.microsoft.com/office/word/2006/wordml" xmlns:wps="http://schemas.microsoft.com/office/word/2010/wordprocessingShape" mc:Ignorable="w14 w15 w16se w16cid w16 w16cex wp14">
+<w:document xmlns:wpc="http://schemas.microsoft.com/office/word/2010/wordprocessingCanvas" xmlns:cx="http://schemas.microsoft.com/office/drawing/2014/chartex" xmlns:cx1="http://schemas.microsoft.com/office/drawing/2015/9/8/chartex" xmlns:cx2="http://schemas.microsoft.com/office/drawing/2015/10/21/chartex" xmlns:cx3="http://schemas.microsoft.com/office/drawing/2016/5/9/chartex" xmlns:cx4="http://schemas.microsoft.com/office/drawing/2016/5/10/chartex" xmlns:cx5="http://schemas.microsoft.com/office/drawing/2016/5/11/chartex" xmlns:cx6="http://schemas.microsoft.com/office/drawing/2016/5/12/chartex" xmlns:cx7="http://schemas.microsoft.com/office/drawing/2016/5/13/chartex" xmlns:cx8="http://schemas.microsoft.com/office/drawing/2016/5/14/chartex" xmlns:mc="http://schemas.openxmlformats.org/markup-compatibility/2006" xmlns:aink="http://schemas.microsoft.com/office/drawing/2016/ink" xmlns:am3d="http://schemas.microsoft.com/office/drawing/2017/model3d" xmlns:o="urn:schemas-microsoft-com:office:office" xmlns:oel="http://schemas.microsoft.com/office/2019/extlst" xmlns:r="http://schemas.openxmlformats.org/officeDocument/2006/relationships" xmlns:m="http://schemas.openxmlformats.org/officeDocument/2006/math" xmlns:v="urn:schemas-microsoft-com:vml" xmlns:wp14="http://schemas.microsoft.com/office/word/2010/wordprocessingDrawing" xmlns:wp="http://schemas.openxmlformats.org/drawingml/2006/wordprocessingDrawing" xmlns:w10="urn:schemas-microsoft-com:office:word" xmlns:w="http://schemas.openxmlformats.org/wordprocessingml/2006/main" xmlns:w14="http://schemas.microsoft.com/office/word/2010/wordml" xmlns:w15="http://schemas.microsoft.com/office/word/2012/wordml" xmlns:w16cex="http://schemas.microsoft.com/office/word/2018/wordml/cex" xmlns:w16cid="http://schemas.microsoft.com/office/word/2016/wordml/cid" xmlns:w16="http://schemas.microsoft.com/office/word/2018/wordml" xmlns:w16du="http://schemas.microsoft.com/office/word/2023/wordml/word16du" xmlns:w16sdtdh="http://schemas.microsoft.com/office/word/2020/wordml/sdtdatahash" xmlns:w16sdtfl="http://schemas.microsoft.com/office/word/2024/wordml/sdtformatlock" xmlns:w16se="http://schemas.microsoft.com/office/word/2015/wordml/symex" xmlns:wpg="http://schemas.microsoft.com/office/word/2010/wordprocessingGroup" xmlns:wpi="http://schemas.microsoft.com/office/word/2010/wordprocessingInk" xmlns:wne="http://schemas.microsoft.com/office/word/2006/wordml" xmlns:wps="http://schemas.microsoft.com/office/word/2010/wordprocessingShape" mc:Ignorable="w14 w15 w16se w16cid w16 w16cex w16sdtdh w16sdtfl w16du wp14">
   <w:body>
     <w:p>
       <w:pPr>
@@ -143,7 +143,25 @@
           <w:szCs w:val="24"/>
           <w:lang w:val="en-GB"/>
         </w:rPr>
-        <w:t xml:space="preserve"> advantage in producing X?</w:t>
+        <w:t xml:space="preserve"> advantage in producing X</w:t>
+      </w:r>
+      <w:r>
+        <w:rPr>
+          <w:rFonts w:ascii="Times New Roman" w:hAnsi="Times New Roman" w:cs="Times New Roman"/>
+          <w:sz w:val="24"/>
+          <w:szCs w:val="24"/>
+          <w:lang w:val="en-GB"/>
+        </w:rPr>
+        <w:t>, workers or machines</w:t>
+      </w:r>
+      <w:r>
+        <w:rPr>
+          <w:rFonts w:ascii="Times New Roman" w:hAnsi="Times New Roman" w:cs="Times New Roman"/>
+          <w:sz w:val="24"/>
+          <w:szCs w:val="24"/>
+          <w:lang w:val="en-GB"/>
+        </w:rPr>
+        <w:t>?</w:t>
       </w:r>
     </w:p>
     <w:p>
@@ -187,7 +205,34 @@
           <w:szCs w:val="24"/>
           <w:lang w:val="en-GB"/>
         </w:rPr>
-        <w:t>advantage in producing Y?</w:t>
+        <w:t>advantage in producing Y</w:t>
+      </w:r>
+      <w:r>
+        <w:rPr>
+          <w:rFonts w:ascii="Times New Roman" w:hAnsi="Times New Roman" w:cs="Times New Roman"/>
+          <w:sz w:val="24"/>
+          <w:szCs w:val="24"/>
+          <w:lang w:val="en-GB"/>
+        </w:rPr>
+        <w:t xml:space="preserve">, </w:t>
+      </w:r>
+      <w:r>
+        <w:rPr>
+          <w:rFonts w:ascii="Times New Roman" w:hAnsi="Times New Roman" w:cs="Times New Roman"/>
+          <w:sz w:val="24"/>
+          <w:szCs w:val="24"/>
+          <w:lang w:val="en-GB"/>
+        </w:rPr>
+        <w:t>workers or machines</w:t>
+      </w:r>
+      <w:r>
+        <w:rPr>
+          <w:rFonts w:ascii="Times New Roman" w:hAnsi="Times New Roman" w:cs="Times New Roman"/>
+          <w:sz w:val="24"/>
+          <w:szCs w:val="24"/>
+          <w:lang w:val="en-GB"/>
+        </w:rPr>
+        <w:t>?</w:t>
       </w:r>
     </w:p>
     <w:p>
@@ -306,27 +351,7 @@
           <w:szCs w:val="24"/>
           <w:lang w:val="en-GB"/>
         </w:rPr>
-        <w:t xml:space="preserve">Suppose there are two independent countries Zulu and </w:t>
-      </w:r>
-      <w:proofErr w:type="spellStart"/>
-      <w:r>
-        <w:rPr>
-          <w:rFonts w:ascii="Times New Roman" w:hAnsi="Times New Roman" w:cs="Times New Roman"/>
-          <w:sz w:val="24"/>
-          <w:szCs w:val="24"/>
-          <w:lang w:val="en-GB"/>
-        </w:rPr>
-        <w:t>Wulu</w:t>
-      </w:r>
-      <w:proofErr w:type="spellEnd"/>
-      <w:r>
-        <w:rPr>
-          <w:rFonts w:ascii="Times New Roman" w:hAnsi="Times New Roman" w:cs="Times New Roman"/>
-          <w:sz w:val="24"/>
-          <w:szCs w:val="24"/>
-          <w:lang w:val="en-GB"/>
-        </w:rPr>
-        <w:t xml:space="preserve">. Those countries consume two goods, guns (X) and butter (Y). </w:t>
+        <w:t xml:space="preserve">Suppose there are two independent countries Zulu and Wulu. Those countries consume two goods, guns (X) and butter (Y). </w:t>
       </w:r>
     </w:p>
     <w:p>
@@ -383,27 +408,7 @@
           <w:szCs w:val="24"/>
           <w:lang w:val="en-GB"/>
         </w:rPr>
-        <w:t xml:space="preserve">. Assume that in </w:t>
-      </w:r>
-      <w:proofErr w:type="spellStart"/>
-      <w:r>
-        <w:rPr>
-          <w:rFonts w:ascii="Times New Roman" w:hAnsi="Times New Roman" w:cs="Times New Roman"/>
-          <w:sz w:val="24"/>
-          <w:szCs w:val="24"/>
-          <w:lang w:val="en-GB"/>
-        </w:rPr>
-        <w:t>Wulu</w:t>
-      </w:r>
-      <w:proofErr w:type="spellEnd"/>
-      <w:r>
-        <w:rPr>
-          <w:rFonts w:ascii="Times New Roman" w:hAnsi="Times New Roman" w:cs="Times New Roman"/>
-          <w:sz w:val="24"/>
-          <w:szCs w:val="24"/>
-          <w:lang w:val="en-GB"/>
-        </w:rPr>
-        <w:t xml:space="preserve"> there are 400 workers and each of them can produce 2 units of </w:t>
+        <w:t xml:space="preserve">. Assume that in Wulu there are 400 workers and each of them can produce 2 units of </w:t>
       </w:r>
       <w:r>
         <w:rPr>
@@ -491,19 +496,8 @@
           <w:szCs w:val="24"/>
           <w:lang w:val="en-GB"/>
         </w:rPr>
-        <w:t xml:space="preserve">It is known that each country needs to consume 25 guns for self-defence. How many units of butter will be consumed by each </w:t>
-      </w:r>
-      <w:proofErr w:type="gramStart"/>
-      <w:r>
-        <w:rPr>
-          <w:rFonts w:ascii="Times New Roman" w:hAnsi="Times New Roman" w:cs="Times New Roman"/>
-          <w:sz w:val="24"/>
-          <w:szCs w:val="24"/>
-          <w:lang w:val="en-GB"/>
-        </w:rPr>
-        <w:t>country?</w:t>
-      </w:r>
-      <w:proofErr w:type="gramEnd"/>
+        <w:t>It is known that each country needs to consume 25 guns for self-defence. How many units of butter will be consumed by each country?</w:t>
+      </w:r>
     </w:p>
     <w:p>
       <w:pPr>
@@ -679,7 +673,7 @@
 </file>
 
 <file path=word/numbering.xml><?xml version="1.0" encoding="utf-8"?>
-<w:numbering xmlns:wpc="http://schemas.microsoft.com/office/word/2010/wordprocessingCanvas" xmlns:cx="http://schemas.microsoft.com/office/drawing/2014/chartex" xmlns:cx1="http://schemas.microsoft.com/office/drawing/2015/9/8/chartex" xmlns:cx2="http://schemas.microsoft.com/office/drawing/2015/10/21/chartex" xmlns:cx3="http://schemas.microsoft.com/office/drawing/2016/5/9/chartex" xmlns:cx4="http://schemas.microsoft.com/office/drawing/2016/5/10/chartex" xmlns:cx5="http://schemas.microsoft.com/office/drawing/2016/5/11/chartex" xmlns:cx6="http://schemas.microsoft.com/office/drawing/2016/5/12/chartex" xmlns:cx7="http://schemas.microsoft.com/office/drawing/2016/5/13/chartex" xmlns:cx8="http://schemas.microsoft.com/office/drawing/2016/5/14/chartex" xmlns:mc="http://schemas.openxmlformats.org/markup-compatibility/2006" xmlns:aink="http://schemas.microsoft.com/office/drawing/2016/ink" xmlns:am3d="http://schemas.microsoft.com/office/drawing/2017/model3d" xmlns:o="urn:schemas-microsoft-com:office:office" xmlns:r="http://schemas.openxmlformats.org/officeDocument/2006/relationships" xmlns:m="http://schemas.openxmlformats.org/officeDocument/2006/math" xmlns:v="urn:schemas-microsoft-com:vml" xmlns:wp14="http://schemas.microsoft.com/office/word/2010/wordprocessingDrawing" xmlns:wp="http://schemas.openxmlformats.org/drawingml/2006/wordprocessingDrawing" xmlns:w10="urn:schemas-microsoft-com:office:word" xmlns:w="http://schemas.openxmlformats.org/wordprocessingml/2006/main" xmlns:w14="http://schemas.microsoft.com/office/word/2010/wordml" xmlns:w15="http://schemas.microsoft.com/office/word/2012/wordml" xmlns:w16cex="http://schemas.microsoft.com/office/word/2018/wordml/cex" xmlns:w16cid="http://schemas.microsoft.com/office/word/2016/wordml/cid" xmlns:w16="http://schemas.microsoft.com/office/word/2018/wordml" xmlns:w16se="http://schemas.microsoft.com/office/word/2015/wordml/symex" xmlns:wpg="http://schemas.microsoft.com/office/word/2010/wordprocessingGroup" xmlns:wpi="http://schemas.microsoft.com/office/word/2010/wordprocessingInk" xmlns:wne="http://schemas.microsoft.com/office/word/2006/wordml" xmlns:wps="http://schemas.microsoft.com/office/word/2010/wordprocessingShape" mc:Ignorable="w14 w15 w16se w16cid w16 w16cex wp14">
+<w:numbering xmlns:wpc="http://schemas.microsoft.com/office/word/2010/wordprocessingCanvas" xmlns:cx="http://schemas.microsoft.com/office/drawing/2014/chartex" xmlns:cx1="http://schemas.microsoft.com/office/drawing/2015/9/8/chartex" xmlns:cx2="http://schemas.microsoft.com/office/drawing/2015/10/21/chartex" xmlns:cx3="http://schemas.microsoft.com/office/drawing/2016/5/9/chartex" xmlns:cx4="http://schemas.microsoft.com/office/drawing/2016/5/10/chartex" xmlns:cx5="http://schemas.microsoft.com/office/drawing/2016/5/11/chartex" xmlns:cx6="http://schemas.microsoft.com/office/drawing/2016/5/12/chartex" xmlns:cx7="http://schemas.microsoft.com/office/drawing/2016/5/13/chartex" xmlns:cx8="http://schemas.microsoft.com/office/drawing/2016/5/14/chartex" xmlns:mc="http://schemas.openxmlformats.org/markup-compatibility/2006" xmlns:aink="http://schemas.microsoft.com/office/drawing/2016/ink" xmlns:am3d="http://schemas.microsoft.com/office/drawing/2017/model3d" xmlns:o="urn:schemas-microsoft-com:office:office" xmlns:oel="http://schemas.microsoft.com/office/2019/extlst" xmlns:r="http://schemas.openxmlformats.org/officeDocument/2006/relationships" xmlns:m="http://schemas.openxmlformats.org/officeDocument/2006/math" xmlns:v="urn:schemas-microsoft-com:vml" xmlns:wp14="http://schemas.microsoft.com/office/word/2010/wordprocessingDrawing" xmlns:wp="http://schemas.openxmlformats.org/drawingml/2006/wordprocessingDrawing" xmlns:w10="urn:schemas-microsoft-com:office:word" xmlns:w="http://schemas.openxmlformats.org/wordprocessingml/2006/main" xmlns:w14="http://schemas.microsoft.com/office/word/2010/wordml" xmlns:w15="http://schemas.microsoft.com/office/word/2012/wordml" xmlns:w16cex="http://schemas.microsoft.com/office/word/2018/wordml/cex" xmlns:w16cid="http://schemas.microsoft.com/office/word/2016/wordml/cid" xmlns:w16="http://schemas.microsoft.com/office/word/2018/wordml" xmlns:w16du="http://schemas.microsoft.com/office/word/2023/wordml/word16du" xmlns:w16sdtdh="http://schemas.microsoft.com/office/word/2020/wordml/sdtdatahash" xmlns:w16sdtfl="http://schemas.microsoft.com/office/word/2024/wordml/sdtformatlock" xmlns:w16se="http://schemas.microsoft.com/office/word/2015/wordml/symex" xmlns:wpg="http://schemas.microsoft.com/office/word/2010/wordprocessingGroup" xmlns:wpi="http://schemas.microsoft.com/office/word/2010/wordprocessingInk" xmlns:wne="http://schemas.microsoft.com/office/word/2006/wordml" xmlns:wps="http://schemas.microsoft.com/office/word/2010/wordprocessingShape" mc:Ignorable="w14 w15 w16se w16cid w16 w16cex w16sdtdh w16sdtfl w16du wp14">
   <w:abstractNum w:abstractNumId="0" w15:restartNumberingAfterBreak="0">
     <w:nsid w:val="2B2C7887"/>
     <w:multiLevelType w:val="hybridMultilevel"/>
@@ -947,20 +941,20 @@
       </w:pPr>
     </w:lvl>
   </w:abstractNum>
-  <w:num w:numId="1">
+  <w:num w:numId="1" w16cid:durableId="767232166">
     <w:abstractNumId w:val="0"/>
   </w:num>
-  <w:num w:numId="2">
+  <w:num w:numId="2" w16cid:durableId="1672828928">
     <w:abstractNumId w:val="2"/>
   </w:num>
-  <w:num w:numId="3">
+  <w:num w:numId="3" w16cid:durableId="545919466">
     <w:abstractNumId w:val="1"/>
   </w:num>
 </w:numbering>
 </file>
 
 <file path=word/styles.xml><?xml version="1.0" encoding="utf-8"?>
-<w:styles xmlns:mc="http://schemas.openxmlformats.org/markup-compatibility/2006" xmlns:r="http://schemas.openxmlformats.org/officeDocument/2006/relationships" xmlns:w="http://schemas.openxmlformats.org/wordprocessingml/2006/main" xmlns:w14="http://schemas.microsoft.com/office/word/2010/wordml" xmlns:w15="http://schemas.microsoft.com/office/word/2012/wordml" xmlns:w16cex="http://schemas.microsoft.com/office/word/2018/wordml/cex" xmlns:w16cid="http://schemas.microsoft.com/office/word/2016/wordml/cid" xmlns:w16="http://schemas.microsoft.com/office/word/2018/wordml" xmlns:w16se="http://schemas.microsoft.com/office/word/2015/wordml/symex" mc:Ignorable="w14 w15 w16se w16cid w16 w16cex">
+<w:styles xmlns:mc="http://schemas.openxmlformats.org/markup-compatibility/2006" xmlns:r="http://schemas.openxmlformats.org/officeDocument/2006/relationships" xmlns:w="http://schemas.openxmlformats.org/wordprocessingml/2006/main" xmlns:w14="http://schemas.microsoft.com/office/word/2010/wordml" xmlns:w15="http://schemas.microsoft.com/office/word/2012/wordml" xmlns:w16cex="http://schemas.microsoft.com/office/word/2018/wordml/cex" xmlns:w16cid="http://schemas.microsoft.com/office/word/2016/wordml/cid" xmlns:w16="http://schemas.microsoft.com/office/word/2018/wordml" xmlns:w16du="http://schemas.microsoft.com/office/word/2023/wordml/word16du" xmlns:w16sdtdh="http://schemas.microsoft.com/office/word/2020/wordml/sdtdatahash" xmlns:w16sdtfl="http://schemas.microsoft.com/office/word/2024/wordml/sdtformatlock" xmlns:w16se="http://schemas.microsoft.com/office/word/2015/wordml/symex" mc:Ignorable="w14 w15 w16se w16cid w16 w16cex w16sdtdh w16sdtfl w16du">
   <w:docDefaults>
     <w:rPrDefault>
       <w:rPr>
@@ -1082,6 +1076,7 @@
     <w:lsdException w:name="HTML Sample" w:semiHidden="1" w:unhideWhenUsed="1"/>
     <w:lsdException w:name="HTML Typewriter" w:semiHidden="1" w:unhideWhenUsed="1"/>
     <w:lsdException w:name="HTML Variable" w:semiHidden="1" w:unhideWhenUsed="1"/>
+    <w:lsdException w:name="Normal Table" w:semiHidden="1" w:unhideWhenUsed="1"/>
     <w:lsdException w:name="annotation subject" w:semiHidden="1" w:unhideWhenUsed="1"/>
     <w:lsdException w:name="No List" w:semiHidden="1" w:unhideWhenUsed="1"/>
     <w:lsdException w:name="Outline List 1" w:semiHidden="1" w:unhideWhenUsed="1"/>
@@ -1124,8 +1119,11 @@
     <w:lsdException w:name="Table Contemporary" w:semiHidden="1" w:unhideWhenUsed="1"/>
     <w:lsdException w:name="Table Elegant" w:semiHidden="1" w:unhideWhenUsed="1"/>
     <w:lsdException w:name="Table Professional" w:semiHidden="1" w:unhideWhenUsed="1"/>
+    <w:lsdException w:name="Table Subtle 1" w:semiHidden="1" w:unhideWhenUsed="1"/>
     <w:lsdException w:name="Table Subtle 2" w:semiHidden="1" w:unhideWhenUsed="1"/>
     <w:lsdException w:name="Table Web 1" w:semiHidden="1" w:unhideWhenUsed="1"/>
+    <w:lsdException w:name="Table Web 2" w:semiHidden="1" w:unhideWhenUsed="1"/>
+    <w:lsdException w:name="Table Web 3" w:semiHidden="1" w:unhideWhenUsed="1"/>
     <w:lsdException w:name="Balloon Text" w:semiHidden="1" w:unhideWhenUsed="1"/>
     <w:lsdException w:name="Table Grid" w:uiPriority="39"/>
     <w:lsdException w:name="Table Theme" w:semiHidden="1" w:unhideWhenUsed="1"/>
@@ -1657,21 +1655,6 @@
 </file>
 
 <file path=customXml/item1.xml><?xml version="1.0" encoding="utf-8"?>
-<?mso-contentType ?>
-<FormTemplates xmlns="http://schemas.microsoft.com/sharepoint/v3/contenttype/forms">
-  <Display>DocumentLibraryForm</Display>
-  <Edit>DocumentLibraryForm</Edit>
-  <New>DocumentLibraryForm</New>
-</FormTemplates>
-</file>
-
-<file path=customXml/item2.xml><?xml version="1.0" encoding="utf-8"?>
-<p:properties xmlns:p="http://schemas.microsoft.com/office/2006/metadata/properties" xmlns:xsi="http://www.w3.org/2001/XMLSchema-instance" xmlns:pc="http://schemas.microsoft.com/office/infopath/2007/PartnerControls">
-  <documentManagement/>
-</p:properties>
-</file>
-
-<file path=customXml/item3.xml><?xml version="1.0" encoding="utf-8"?>
 <ct:contentTypeSchema xmlns:ct="http://schemas.microsoft.com/office/2006/metadata/contentType" xmlns:ma="http://schemas.microsoft.com/office/2006/metadata/properties/metaAttributes" ct:_="" ma:_="" ma:contentTypeName="Dokument" ma:contentTypeID="0x010100AF7205A957E27D4482920B8AEB6DD441" ma:contentTypeVersion="8" ma:contentTypeDescription="Opprett et nytt dokument." ma:contentTypeScope="" ma:versionID="7e179cf5d29fa528eaa9dcf6372d216a">
   <xsd:schema xmlns:xsd="http://www.w3.org/2001/XMLSchema" xmlns:xs="http://www.w3.org/2001/XMLSchema" xmlns:p="http://schemas.microsoft.com/office/2006/metadata/properties" xmlns:ns3="8d06b583-6812-4d40-a551-55e7a6aaa1bf" targetNamespace="http://schemas.microsoft.com/office/2006/metadata/properties" ma:root="true" ma:fieldsID="347e4a5d60c22f2956b0e05e1abcecc4" ns3:_="">
     <xsd:import namespace="8d06b583-6812-4d40-a551-55e7a6aaa1bf"/>
@@ -1841,24 +1824,22 @@
 </ct:contentTypeSchema>
 </file>
 
-<file path=customXml/itemProps1.xml><?xml version="1.0" encoding="utf-8"?>
-<ds:datastoreItem xmlns:ds="http://schemas.openxmlformats.org/officeDocument/2006/customXml" ds:itemID="{86B9F495-37D2-4D51-9217-AC1EBAD2E043}">
-  <ds:schemaRefs>
-    <ds:schemaRef ds:uri="http://schemas.microsoft.com/sharepoint/v3/contenttype/forms"/>
-  </ds:schemaRefs>
-</ds:datastoreItem>
+<file path=customXml/item2.xml><?xml version="1.0" encoding="utf-8"?>
+<p:properties xmlns:p="http://schemas.microsoft.com/office/2006/metadata/properties" xmlns:xsi="http://www.w3.org/2001/XMLSchema-instance" xmlns:pc="http://schemas.microsoft.com/office/infopath/2007/PartnerControls">
+  <documentManagement/>
+</p:properties>
 </file>
 
-<file path=customXml/itemProps2.xml><?xml version="1.0" encoding="utf-8"?>
-<ds:datastoreItem xmlns:ds="http://schemas.openxmlformats.org/officeDocument/2006/customXml" ds:itemID="{766EF760-EA21-4A46-9F6F-F94E0994BF8F}">
-  <ds:schemaRefs>
-    <ds:schemaRef ds:uri="http://schemas.microsoft.com/office/2006/metadata/properties"/>
-    <ds:schemaRef ds:uri="http://schemas.microsoft.com/office/infopath/2007/PartnerControls"/>
-  </ds:schemaRefs>
-</ds:datastoreItem>
+<file path=customXml/item3.xml><?xml version="1.0" encoding="utf-8"?>
+<?mso-contentType ?>
+<FormTemplates xmlns="http://schemas.microsoft.com/sharepoint/v3/contenttype/forms">
+  <Display>DocumentLibraryForm</Display>
+  <Edit>DocumentLibraryForm</Edit>
+  <New>DocumentLibraryForm</New>
+</FormTemplates>
 </file>
 
-<file path=customXml/itemProps3.xml><?xml version="1.0" encoding="utf-8"?>
+<file path=customXml/itemProps1.xml><?xml version="1.0" encoding="utf-8"?>
 <ds:datastoreItem xmlns:ds="http://schemas.openxmlformats.org/officeDocument/2006/customXml" ds:itemID="{CE4E02E5-A302-451F-BE5F-F93B993E29B7}">
   <ds:schemaRefs>
     <ds:schemaRef ds:uri="http://schemas.microsoft.com/office/2006/metadata/contentType"/>
@@ -1874,4 +1855,21 @@
     <ds:schemaRef ds:uri="http://schemas.microsoft.com/internal/obd"/>
   </ds:schemaRefs>
 </ds:datastoreItem>
+</file>
+
+<file path=customXml/itemProps2.xml><?xml version="1.0" encoding="utf-8"?>
+<ds:datastoreItem xmlns:ds="http://schemas.openxmlformats.org/officeDocument/2006/customXml" ds:itemID="{766EF760-EA21-4A46-9F6F-F94E0994BF8F}">
+  <ds:schemaRefs>
+    <ds:schemaRef ds:uri="http://schemas.microsoft.com/office/2006/metadata/properties"/>
+    <ds:schemaRef ds:uri="http://schemas.microsoft.com/office/infopath/2007/PartnerControls"/>
+  </ds:schemaRefs>
+</ds:datastoreItem>
+</file>
+
+<file path=customXml/itemProps3.xml><?xml version="1.0" encoding="utf-8"?>
+<ds:datastoreItem xmlns:ds="http://schemas.openxmlformats.org/officeDocument/2006/customXml" ds:itemID="{86B9F495-37D2-4D51-9217-AC1EBAD2E043}">
+  <ds:schemaRefs>
+    <ds:schemaRef ds:uri="http://schemas.microsoft.com/sharepoint/v3/contenttype/forms"/>
+  </ds:schemaRefs>
+</ds:datastoreItem>
 </file>
</xml_diff>